<commit_message>
Memo pack: add what a lift does and does not save, and the proposed sequence
Two paragraphs in the roof-lift section of the clarification. Ground-up stage
and VIP decking do not by themselves take steel out of the roof (already banked
at 8.65 lb/SF); a partial lift is close to a wash on cost and is worth doing
for exposure and schedule, not steel; the steel that costs money is the
columns and bracing driven by height and the terrace. Sequence: roof material
first, then programme and height, then the lift as a bonus.

Co-Authored-By: Claude Fable 5.1 <noreply@anthropic.com>
Claude-Session: https://claude.ai/code/session_01PEmGwH7ywekbMMAmQPcL64
</commit_message>
<xml_diff>
--- a/models/165-randolph/memo/165_Randolph_The_BLOCK_Questions_Recommendations_Clarification.docx
+++ b/models/165-randolph/memo/165_Randolph_The_BLOCK_Questions_Recommendations_Clarification.docx
@@ -3257,6 +3257,42 @@
           <w:b/>
           <w:sz w:val="19"/>
         </w:rPr>
+        <w:t>What a lift does and does not save.</w:t>
+      </w:r>
+      <w:r>
+        <w:rPr>
+          <w:sz w:val="19"/>
+        </w:rPr>
+        <w:t xml:space="preserve"> Three things worth being clear about so nobody expects the wrong result. First, the ground-up stage and VIP decking do not by themselves take steel out of the roof — the model already assumes the roof carries no rigging, which is why the high roof is only 8.65 lb/SF, and our ground-supported structure is the reason it can be that light. That saving is already banked. Second, what a partial lift over the house avoids is the new high-roof steel (118.5 tons), its deck, its membrane and the demolition of that zone, against which sits the lifter’s contract, the column extensions and the temporary works — on cost that is close to a wash, and the case for it is weather exposure, a smaller demolition and possibly the DOB route, not the steel. Third, the steel that actually costs money is the columns and bracing, 359 tons and 37% of the building, driven by 60 ft of column height and by carrying the occupied terrace. If the aim is materially less steel, the levers are the programme (the terrace and the third floor) and the roof height (whether the clear height really needs +64 ft 6 in), and those move far more tonnage than any lift does.</w:t>
+      </w:r>
+    </w:p>
+    <w:p>
+      <w:pPr>
+        <w:spacing w:after="100"/>
+      </w:pPr>
+      <w:r>
+        <w:rPr>
+          <w:b/>
+          <w:sz w:val="19"/>
+        </w:rPr>
+        <w:t>So the sequence we propose:</w:t>
+      </w:r>
+      <w:r>
+        <w:rPr>
+          <w:sz w:val="19"/>
+        </w:rPr>
+        <w:t xml:space="preserve"> (1) confirm what the existing roof is made of — if it is pre-cast, the lift is probably dead and we stop spending time on it; (2) settle the terrace and the height with Nate, because that is where the steel is; (3) if the roof turns out to be liftable, take the partial lift for the schedule and exposure benefits, with whatever steel it saves as a bonus.</w:t>
+      </w:r>
+    </w:p>
+    <w:p>
+      <w:pPr>
+        <w:spacing w:after="100"/>
+      </w:pPr>
+      <w:r>
+        <w:rPr>
+          <w:b/>
+          <w:sz w:val="19"/>
+        </w:rPr>
         <w:t>If the answers come back pre-cast and no</w:t>
       </w:r>
       <w:r>

</xml_diff>